<commit_message>
CORRECTION : Conditions, rajout des FIN SI
</commit_message>
<xml_diff>
--- a/02-Conditions.docx
+++ b/02-Conditions.docx
@@ -101,6 +101,14 @@
     </w:p>
     <w:p>
       <w:pPr>
+        <w:pStyle w:val="Code"/>
+      </w:pPr>
+      <w:r>
+        <w:t>FIN SI</w:t>
+      </w:r>
+    </w:p>
+    <w:p>
+      <w:pPr>
         <w:pStyle w:val="Titre1"/>
       </w:pPr>
       <w:r>
@@ -157,8 +165,13 @@
         </w:numPr>
       </w:pPr>
       <w:r>
-        <w:t>Créer une variable Password</w:t>
-      </w:r>
+        <w:t xml:space="preserve">Créer une variable </w:t>
+      </w:r>
+      <w:proofErr w:type="spellStart"/>
+      <w:r>
+        <w:t>Password</w:t>
+      </w:r>
+      <w:proofErr w:type="spellEnd"/>
     </w:p>
     <w:p>
       <w:pPr>
@@ -180,8 +193,13 @@
           <w:numId w:val="25"/>
         </w:numPr>
       </w:pPr>
-      <w:r>
-        <w:t>Password &lt;- le mot de passe entré</w:t>
+      <w:proofErr w:type="spellStart"/>
+      <w:r>
+        <w:t>Password</w:t>
+      </w:r>
+      <w:proofErr w:type="spellEnd"/>
+      <w:r>
+        <w:t xml:space="preserve"> &lt;- le mot de passe entré</w:t>
       </w:r>
     </w:p>
     <w:p>
@@ -193,7 +211,23 @@
         </w:numPr>
       </w:pPr>
       <w:r>
-        <w:t>SI Password === Password attendu</w:t>
+        <w:t xml:space="preserve">SI </w:t>
+      </w:r>
+      <w:proofErr w:type="spellStart"/>
+      <w:r>
+        <w:t>Password</w:t>
+      </w:r>
+      <w:proofErr w:type="spellEnd"/>
+      <w:r>
+        <w:t xml:space="preserve"> === </w:t>
+      </w:r>
+      <w:proofErr w:type="spellStart"/>
+      <w:r>
+        <w:t>Password</w:t>
+      </w:r>
+      <w:proofErr w:type="spellEnd"/>
+      <w:r>
+        <w:t xml:space="preserve"> attendu</w:t>
       </w:r>
     </w:p>
     <w:p>
@@ -221,6 +255,18 @@
       </w:r>
     </w:p>
     <w:p>
+      <w:pPr>
+        <w:pStyle w:val="Code"/>
+        <w:numPr>
+          <w:ilvl w:val="0"/>
+          <w:numId w:val="25"/>
+        </w:numPr>
+      </w:pPr>
+      <w:r>
+        <w:t>FIN SI</w:t>
+      </w:r>
+    </w:p>
+    <w:p>
       <w:r>
         <w:t xml:space="preserve">Variante : </w:t>
       </w:r>
@@ -254,8 +300,13 @@
         </w:numPr>
       </w:pPr>
       <w:r>
-        <w:t>Créer une variable Password</w:t>
-      </w:r>
+        <w:t xml:space="preserve">Créer une variable </w:t>
+      </w:r>
+      <w:proofErr w:type="spellStart"/>
+      <w:r>
+        <w:t>Password</w:t>
+      </w:r>
+      <w:proofErr w:type="spellEnd"/>
     </w:p>
     <w:p>
       <w:pPr>
@@ -277,8 +328,13 @@
           <w:numId w:val="26"/>
         </w:numPr>
       </w:pPr>
-      <w:r>
-        <w:t>Password &lt;- le mot de passe entré</w:t>
+      <w:proofErr w:type="spellStart"/>
+      <w:r>
+        <w:t>Password</w:t>
+      </w:r>
+      <w:proofErr w:type="spellEnd"/>
+      <w:r>
+        <w:t xml:space="preserve"> &lt;- le mot de passe entré</w:t>
       </w:r>
     </w:p>
     <w:p>
@@ -290,7 +346,15 @@
         </w:numPr>
       </w:pPr>
       <w:r>
-        <w:t>SI taille du Password &lt; 12</w:t>
+        <w:t xml:space="preserve">SI taille du </w:t>
+      </w:r>
+      <w:proofErr w:type="spellStart"/>
+      <w:r>
+        <w:t>Password</w:t>
+      </w:r>
+      <w:proofErr w:type="spellEnd"/>
+      <w:r>
+        <w:t xml:space="preserve"> &lt; 12</w:t>
       </w:r>
     </w:p>
     <w:p>
@@ -314,7 +378,23 @@
         </w:numPr>
       </w:pPr>
       <w:r>
-        <w:t>SI Password === Password attendu</w:t>
+        <w:t xml:space="preserve">SI </w:t>
+      </w:r>
+      <w:proofErr w:type="spellStart"/>
+      <w:r>
+        <w:t>Password</w:t>
+      </w:r>
+      <w:proofErr w:type="spellEnd"/>
+      <w:r>
+        <w:t xml:space="preserve"> === </w:t>
+      </w:r>
+      <w:proofErr w:type="spellStart"/>
+      <w:r>
+        <w:t>Password</w:t>
+      </w:r>
+      <w:proofErr w:type="spellEnd"/>
+      <w:r>
+        <w:t xml:space="preserve"> attendu</w:t>
       </w:r>
     </w:p>
     <w:p>
@@ -343,13 +423,33 @@
       <w:r>
         <w:t>SINON AFFICHER ‘Erreur !’</w:t>
       </w:r>
+    </w:p>
+    <w:p>
+      <w:pPr>
+        <w:pStyle w:val="Code"/>
+        <w:numPr>
+          <w:ilvl w:val="0"/>
+          <w:numId w:val="26"/>
+        </w:numPr>
+      </w:pPr>
+      <w:r>
+        <w:t>FIN SI</w:t>
+      </w:r>
+    </w:p>
+    <w:p>
+      <w:pPr>
+        <w:pStyle w:val="Code"/>
+        <w:numPr>
+          <w:ilvl w:val="0"/>
+          <w:numId w:val="0"/>
+        </w:numPr>
+        <w:ind w:left="720" w:hanging="360"/>
+      </w:pPr>
     </w:p>
     <w:p/>
     <w:p/>
-    <w:p/>
-    <w:p>
-      <w:r>
-        <w:lastRenderedPageBreak/>
+    <w:p>
+      <w:r>
         <w:t>Version 2</w:t>
       </w:r>
     </w:p>
@@ -362,8 +462,13 @@
         </w:numPr>
       </w:pPr>
       <w:r>
-        <w:t>Créer une variable Password</w:t>
-      </w:r>
+        <w:t xml:space="preserve">Créer une variable </w:t>
+      </w:r>
+      <w:proofErr w:type="spellStart"/>
+      <w:r>
+        <w:t>Password</w:t>
+      </w:r>
+      <w:proofErr w:type="spellEnd"/>
     </w:p>
     <w:p>
       <w:pPr>
@@ -385,8 +490,13 @@
           <w:numId w:val="27"/>
         </w:numPr>
       </w:pPr>
-      <w:r>
-        <w:t>Password &lt;- le mot de passe entré</w:t>
+      <w:proofErr w:type="spellStart"/>
+      <w:r>
+        <w:t>Password</w:t>
+      </w:r>
+      <w:proofErr w:type="spellEnd"/>
+      <w:r>
+        <w:t xml:space="preserve"> &lt;- le mot de passe entré</w:t>
       </w:r>
     </w:p>
     <w:p>
@@ -398,10 +508,34 @@
         </w:numPr>
       </w:pPr>
       <w:r>
-        <w:t>SI Password === Password attendu</w:t>
-      </w:r>
-      <w:r>
-        <w:t xml:space="preserve"> ET Taille du Password &gt;= 12</w:t>
+        <w:t xml:space="preserve">SI </w:t>
+      </w:r>
+      <w:proofErr w:type="spellStart"/>
+      <w:r>
+        <w:t>Password</w:t>
+      </w:r>
+      <w:proofErr w:type="spellEnd"/>
+      <w:r>
+        <w:t xml:space="preserve"> === </w:t>
+      </w:r>
+      <w:proofErr w:type="spellStart"/>
+      <w:r>
+        <w:t>Password</w:t>
+      </w:r>
+      <w:proofErr w:type="spellEnd"/>
+      <w:r>
+        <w:t xml:space="preserve"> attendu</w:t>
+      </w:r>
+      <w:r>
+        <w:t xml:space="preserve"> ET Taille du </w:t>
+      </w:r>
+      <w:proofErr w:type="spellStart"/>
+      <w:r>
+        <w:t>Password</w:t>
+      </w:r>
+      <w:proofErr w:type="spellEnd"/>
+      <w:r>
+        <w:t xml:space="preserve"> &gt;= 12</w:t>
       </w:r>
     </w:p>
     <w:p>
@@ -427,8 +561,17 @@
       <w:r>
         <w:t>SINON AFFICHER ‘Erreur !’</w:t>
       </w:r>
-      <w:r>
-        <w:br/>
+    </w:p>
+    <w:p>
+      <w:pPr>
+        <w:pStyle w:val="Code"/>
+        <w:numPr>
+          <w:ilvl w:val="0"/>
+          <w:numId w:val="27"/>
+        </w:numPr>
+      </w:pPr>
+      <w:r>
+        <w:t>FIN SI</w:t>
       </w:r>
     </w:p>
     <w:p>
@@ -571,6 +714,18 @@
       </w:r>
     </w:p>
     <w:p>
+      <w:pPr>
+        <w:pStyle w:val="Code"/>
+        <w:numPr>
+          <w:ilvl w:val="0"/>
+          <w:numId w:val="28"/>
+        </w:numPr>
+      </w:pPr>
+      <w:r>
+        <w:t>FIN SI</w:t>
+      </w:r>
+    </w:p>
+    <w:p>
       <w:r>
         <w:t xml:space="preserve">Variante : </w:t>
       </w:r>
@@ -658,10 +813,18 @@
         <w:t xml:space="preserve">- </w:t>
       </w:r>
       <w:r>
-        <w:t>Très Bien</w:t>
-      </w:r>
-      <w:r>
-        <w:t>!’</w:t>
+        <w:t xml:space="preserve">Très </w:t>
+      </w:r>
+      <w:proofErr w:type="gramStart"/>
+      <w:r>
+        <w:t>Bien</w:t>
+      </w:r>
+      <w:r>
+        <w:t>!</w:t>
+      </w:r>
+      <w:proofErr w:type="gramEnd"/>
+      <w:r>
+        <w:t>’</w:t>
       </w:r>
     </w:p>
     <w:p>
@@ -761,17 +924,26 @@
       </w:pPr>
       <w:r>
         <w:t>SINON AFFICHER ‘Refusé !’</w:t>
+      </w:r>
+    </w:p>
+    <w:p>
+      <w:pPr>
+        <w:pStyle w:val="Code"/>
+        <w:numPr>
+          <w:ilvl w:val="0"/>
+          <w:numId w:val="29"/>
+        </w:numPr>
+      </w:pPr>
+      <w:r>
+        <w:t>FIN SI</w:t>
       </w:r>
     </w:p>
     <w:p/>
     <w:p/>
     <w:p/>
     <w:p/>
-    <w:p/>
-    <w:p/>
-    <w:p>
-      <w:r>
-        <w:lastRenderedPageBreak/>
+    <w:p>
+      <w:r>
         <w:t>Variante 2</w:t>
       </w:r>
     </w:p>
@@ -865,7 +1037,15 @@
         <w:t xml:space="preserve">   AFFICHER </w:t>
       </w:r>
       <w:r>
-        <w:t>‘Admis - Très Bien!’</w:t>
+        <w:t xml:space="preserve">‘Admis - Très </w:t>
+      </w:r>
+      <w:proofErr w:type="gramStart"/>
+      <w:r>
+        <w:t>Bien!</w:t>
+      </w:r>
+      <w:proofErr w:type="gramEnd"/>
+      <w:r>
+        <w:t>’</w:t>
       </w:r>
     </w:p>
     <w:p>
@@ -939,6 +1119,18 @@
     </w:p>
     <w:p>
       <w:pPr>
+        <w:pStyle w:val="Code"/>
+        <w:numPr>
+          <w:ilvl w:val="0"/>
+          <w:numId w:val="30"/>
+        </w:numPr>
+      </w:pPr>
+      <w:r>
+        <w:t>FIN SI</w:t>
+      </w:r>
+    </w:p>
+    <w:p>
+      <w:pPr>
         <w:pStyle w:val="Titre1"/>
       </w:pPr>
       <w:r>
@@ -1079,6 +1271,18 @@
         </w:numPr>
       </w:pPr>
       <w:r>
+        <w:t>FIN SI</w:t>
+      </w:r>
+    </w:p>
+    <w:p>
+      <w:pPr>
+        <w:pStyle w:val="Code"/>
+        <w:numPr>
+          <w:ilvl w:val="0"/>
+          <w:numId w:val="31"/>
+        </w:numPr>
+      </w:pPr>
+      <w:r>
         <w:t>SI Couleur == ‘Orange’</w:t>
       </w:r>
     </w:p>
@@ -1103,6 +1307,18 @@
         </w:numPr>
       </w:pPr>
       <w:r>
+        <w:t>FIN SI</w:t>
+      </w:r>
+    </w:p>
+    <w:p>
+      <w:pPr>
+        <w:pStyle w:val="Code"/>
+        <w:numPr>
+          <w:ilvl w:val="0"/>
+          <w:numId w:val="31"/>
+        </w:numPr>
+      </w:pPr>
+      <w:r>
         <w:t>SI Couleur == ‘Vert’</w:t>
       </w:r>
     </w:p>
@@ -1116,6 +1332,18 @@
       </w:pPr>
       <w:r>
         <w:t xml:space="preserve">   AFFICHER ‘Avancer’</w:t>
+      </w:r>
+    </w:p>
+    <w:p>
+      <w:pPr>
+        <w:pStyle w:val="Code"/>
+        <w:numPr>
+          <w:ilvl w:val="0"/>
+          <w:numId w:val="31"/>
+        </w:numPr>
+      </w:pPr>
+      <w:r>
+        <w:t>FIN SI</w:t>
       </w:r>
     </w:p>
     <w:sectPr>
@@ -1550,6 +1778,7 @@
                               <w:szCs w:val="22"/>
                             </w:rPr>
                           </w:pPr>
+                          <w:proofErr w:type="gramStart"/>
                           <w:r>
                             <w:rPr>
                               <w:rFonts w:ascii="Arial" w:hAnsi="Arial" w:cs="Arial"/>
@@ -1558,6 +1787,7 @@
                             </w:rPr>
                             <w:t>xx</w:t>
                           </w:r>
+                          <w:proofErr w:type="gramEnd"/>
                           <w:r>
                             <w:rPr>
                               <w:rFonts w:ascii="Arial" w:hAnsi="Arial" w:cs="Arial"/>
@@ -1625,6 +1855,7 @@
                         <w:szCs w:val="22"/>
                       </w:rPr>
                     </w:pPr>
+                    <w:proofErr w:type="gramStart"/>
                     <w:r>
                       <w:rPr>
                         <w:rFonts w:ascii="Arial" w:hAnsi="Arial" w:cs="Arial"/>
@@ -1633,6 +1864,7 @@
                       </w:rPr>
                       <w:t>xx</w:t>
                     </w:r>
+                    <w:proofErr w:type="gramEnd"/>
                     <w:r>
                       <w:rPr>
                         <w:rFonts w:ascii="Arial" w:hAnsi="Arial" w:cs="Arial"/>
@@ -1722,6 +1954,7 @@
                               <w:szCs w:val="22"/>
                             </w:rPr>
                           </w:pPr>
+                          <w:proofErr w:type="gramStart"/>
                           <w:r>
                             <w:rPr>
                               <w:rFonts w:ascii="Arial" w:hAnsi="Arial" w:cs="Arial"/>
@@ -1730,6 +1963,7 @@
                             </w:rPr>
                             <w:t>xx</w:t>
                           </w:r>
+                          <w:proofErr w:type="gramEnd"/>
                           <w:r>
                             <w:rPr>
                               <w:rFonts w:ascii="Arial" w:hAnsi="Arial" w:cs="Arial"/>
@@ -1797,6 +2031,7 @@
                         <w:szCs w:val="22"/>
                       </w:rPr>
                     </w:pPr>
+                    <w:proofErr w:type="gramStart"/>
                     <w:r>
                       <w:rPr>
                         <w:rFonts w:ascii="Arial" w:hAnsi="Arial" w:cs="Arial"/>
@@ -1805,6 +2040,7 @@
                       </w:rPr>
                       <w:t>xx</w:t>
                     </w:r>
+                    <w:proofErr w:type="gramEnd"/>
                     <w:r>
                       <w:rPr>
                         <w:rFonts w:ascii="Arial" w:hAnsi="Arial" w:cs="Arial"/>

</xml_diff>